<commit_message>
docs: fold QA quality-hardening addendum into roadmap
</commit_message>
<xml_diff>
--- a/docs/HybridRAG_V2_Post_Push_Roadmap_Summary_2026-04-20.docx
+++ b/docs/HybridRAG_V2_Post_Push_Roadmap_Summary_2026-04-20.docx
@@ -25,9 +25,9 @@
         </w:rPr>
         <w:t>Date: 2026-04-20</w:t>
         <w:br/>
-        <w:t>Remote push baseline: 975e1bc</w:t>
+        <w:t>Remote push baseline: 822a6ca</w:t>
         <w:br/>
-        <w:t>Updated with independent outside-agent comparative analysis</w:t>
+        <w:t>Updated with independent outside-agent analysis and QA Pillar 6 addendum</w:t>
       </w:r>
     </w:p>
     <w:p>
@@ -59,7 +59,7 @@
         <w:pStyle w:val="ListBullet"/>
       </w:pPr>
       <w:r>
-        <w:t>The main remaining gap is not architecture credibility; it is operating consistency across routing, latency, semantic quality, and evaluation maturity.</w:t>
+        <w:t>The next-visible lift is quality hardening, not one more clever retrieval trick.</w:t>
       </w:r>
     </w:p>
     <w:p>
@@ -203,7 +203,7 @@
         <w:pStyle w:val="Heading1"/>
       </w:pPr>
       <w:r>
-        <w:t>5. Priority Quality Gaps</w:t>
+        <w:t>5. QA-Sharpened Quality Hardening Priorities</w:t>
       </w:r>
     </w:p>
     <w:p>
@@ -211,7 +211,7 @@
         <w:pStyle w:val="ListBullet"/>
       </w:pPr>
       <w:r>
-        <w:t>Router accuracy should be lifted from the current mid-70% band to 90%+.</w:t>
+        <w:t>Router accuracy now includes a locked gold set by family, confusion matrix by family, pre-router deterministic rules, and miss classification into rules / aliases / prompting.</w:t>
       </w:r>
     </w:p>
     <w:p>
@@ -219,7 +219,7 @@
         <w:pStyle w:val="ListBullet"/>
       </w:pPr>
       <w:r>
-        <w:t>p95 wall-clock latency should be reduced to 15 seconds or better on representative queries.</w:t>
+        <w:t>Latency is now framed as stage budgets, not just a single p95 reduction target. Route, retrieve, rerank, aggregate, and generate must each be instrumented and budgeted.</w:t>
       </w:r>
     </w:p>
     <w:p>
@@ -227,7 +227,7 @@
         <w:pStyle w:val="ListBullet"/>
       </w:pPr>
       <w:r>
-        <w:t>RAGAS should move from partial or caveated use to a full decision-grade 391/391 contract.</w:t>
+        <w:t>Semantic consistency now includes a retrieval error taxonomy: wrong family, wrong doc type, wrong time slice, right doc low rank, no useful evidence.</w:t>
       </w:r>
     </w:p>
     <w:p>
@@ -235,7 +235,15 @@
         <w:pStyle w:val="ListBullet"/>
       </w:pPr>
       <w:r>
-        <w:t>Semantic / ENTITY consistency should be lifted so the user experience is less split between strong structured lanes and weaker semantic lanes.</w:t>
+        <w:t>A canonical release scoreboard must exist under one command and one artifact path.</w:t>
+      </w:r>
+    </w:p>
+    <w:p>
+      <w:pPr>
+        <w:pStyle w:val="ListBullet"/>
+      </w:pPr>
+      <w:r>
+        <w:t>Merge discipline now requires versioned interfaces, merged-tree CI, a permanent push-gate smoke panel, and ASCII-safe CLI output.</w:t>
       </w:r>
     </w:p>
     <w:p>
@@ -403,7 +411,7 @@
         <w:pStyle w:val="ListBullet"/>
       </w:pPr>
       <w:r>
-        <w:t>Start quality-hardening work before expanding into lower-value aggregation variants.</w:t>
+        <w:t>Build the locked router set, canonical release scoreboard, and merged-tree push-gate smoke panel.</w:t>
       </w:r>
     </w:p>
     <w:p>
@@ -483,7 +491,7 @@
         <w:pStyle w:val="ListBullet"/>
       </w:pPr>
       <w:r>
-        <w:t>The remote branch will include this document and the associated planning docs after the current commit/push.</w:t>
+        <w:t>The remote branch will include this updated document and the supporting planning docs.</w:t>
       </w:r>
     </w:p>
     <w:sectPr>

</xml_diff>

<commit_message>
docs: scrub attribution and sharpen quality roadmap
</commit_message>
<xml_diff>
--- a/docs/HybridRAG_V2_Post_Push_Roadmap_Summary_2026-04-20.docx
+++ b/docs/HybridRAG_V2_Post_Push_Roadmap_Summary_2026-04-20.docx
@@ -27,7 +27,7 @@
         <w:br/>
         <w:t>Remote push baseline: 822a6ca</w:t>
         <w:br/>
-        <w:t>Updated with independent outside-agent analysis and QA Pillar 6 addendum</w:t>
+        <w:t>Updated with independent external analysis and QA quality-hardening addendum</w:t>
       </w:r>
     </w:p>
     <w:p>
@@ -203,7 +203,7 @@
         <w:pStyle w:val="Heading1"/>
       </w:pPr>
       <w:r>
-        <w:t>5. QA-Sharpened Quality Hardening Priorities</w:t>
+        <w:t>5. Quality-First Direction</w:t>
       </w:r>
     </w:p>
     <w:p>
@@ -211,7 +211,7 @@
         <w:pStyle w:val="ListBullet"/>
       </w:pPr>
       <w:r>
-        <w:t>Router accuracy now includes a locked gold set by family, confusion matrix by family, pre-router deterministic rules, and miss classification into rules / aliases / prompting.</w:t>
+        <w:t>The first two planned sprints are quality-led before broader capability expansion competes for priority.</w:t>
       </w:r>
     </w:p>
     <w:p>
@@ -219,7 +219,7 @@
         <w:pStyle w:val="ListBullet"/>
       </w:pPr>
       <w:r>
-        <w:t>Latency is now framed as stage budgets, not just a single p95 reduction target. Route, retrieve, rerank, aggregate, and generate must each be instrumented and budgeted.</w:t>
+        <w:t>Locked router gold set plus family confusion matrix and deterministic pre-router structured-intent rules.</w:t>
       </w:r>
     </w:p>
     <w:p>
@@ -227,7 +227,7 @@
         <w:pStyle w:val="ListBullet"/>
       </w:pPr>
       <w:r>
-        <w:t>Semantic consistency now includes a retrieval error taxonomy: wrong family, wrong doc type, wrong time slice, right doc low rank, no useful evidence.</w:t>
+        <w:t>Latency is framed as stage budgets, not just a single p95 target.</w:t>
       </w:r>
     </w:p>
     <w:p>
@@ -235,7 +235,7 @@
         <w:pStyle w:val="ListBullet"/>
       </w:pPr>
       <w:r>
-        <w:t>A canonical release scoreboard must exist under one command and one artifact path.</w:t>
+        <w:t>Semantic improvement uses a retrieval error taxonomy, not only headline scores.</w:t>
       </w:r>
     </w:p>
     <w:p>
@@ -243,7 +243,7 @@
         <w:pStyle w:val="ListBullet"/>
       </w:pPr>
       <w:r>
-        <w:t>Merge discipline now requires versioned interfaces, merged-tree CI, a permanent push-gate smoke panel, and ASCII-safe CLI output.</w:t>
+        <w:t>One canonical release scoreboard and merged-tree push-gate discipline are required.</w:t>
       </w:r>
     </w:p>
     <w:p>
@@ -483,7 +483,7 @@
         <w:pStyle w:val="ListBullet"/>
       </w:pPr>
       <w:r>
-        <w:t>The detailed local planning notes live in the supporting markdown files listed above.</w:t>
+        <w:t>The detailed planning notes live in the supporting markdown files listed above.</w:t>
       </w:r>
     </w:p>
     <w:p>

</xml_diff>